<commit_message>
docs: correct publication claims and add truth audit
</commit_message>
<xml_diff>
--- a/docs/articles/publication/NAS_Jetson_Nano_HOME_CLOUD_PROJECT_PROMPTS_RU_EN.docx
+++ b/docs/articles/publication/NAS_Jetson_Nano_HOME_CLOUD_PROJECT_PROMPTS_RU_EN.docx
@@ -1221,7 +1221,7 @@
           </w:tcPr>
           <w:p>
             <w:r>
-              <w:t>Статья опубликована в Habr Sandbox и на GitHub Pages.</w:t>
+              <w:t>GitHub Pages доступен; статья для Habr не опубликована и остаётся черновиком.</w:t>
             </w:r>
           </w:p>
         </w:tc>
@@ -4704,7 +4704,7 @@
         <w:rPr>
           <w:b/>
         </w:rPr>
-        <w:t>Статья опубликована в Habr Sandbox и на GitHub Pages. На 16.07.2026 обновлены данные VPS, zram, containers и Immich; исторические screenshots получили явные подписи.</w:t>
+        <w:t>GitHub Pages доступен; статья для Habr не опубликована и остаётся черновиком. На 16.07.2026 обновлены данные VPS, zram, containers и Immich; исторические screenshots получили явные подписи.</w:t>
       </w:r>
     </w:p>
     <w:p>
@@ -9019,7 +9019,7 @@
         <w:rPr>
           <w:b/>
         </w:rPr>
-        <w:t>The article was published and later updated with current infrastructure facts while preserving screenshots as historical evidence.</w:t>
+        <w:t>The article was not published. Its draft was updated with dated infrastructure observations while preserving screenshots as historical evidence; those observations are not current without a new check.</w:t>
       </w:r>
     </w:p>
     <w:p>

</xml_diff>